<commit_message>
Reorganize scripts into step-based folders; add new outputs and visualizations
Restructured 04_Mutation_Processing/Scripts into numbered step folders (Step1_Extraction through Step6_Mutalyzer and Utilities) for clearer pipeline progression. Added new output files (all_mutations_v0.tsv, lrg_offset_results.csv, bed_to_vcf/, blast_first_hits/, reference_check/ directories). Added data visualizations (fig1-3 PNGs, skipped_variants_dashboard.html) and updated pipeline documentation to v4/v5. Removed outdated flat-structure scripts and intermediate output files now superseded by step-based outputs.

Co-Authored-By: Claude Sonnet 4.6 <noreply@anthropic.com>
</commit_message>
<xml_diff>
--- a/06_Writing/pipeline_documentation_v3.docx
+++ b/06_Writing/pipeline_documentation_v3.docx
@@ -1062,7 +1062,7 @@
         <w:rPr>
           <w:color w:val="000000"/>
         </w:rPr>
-        <w:t>This pipeline migrates 131 immunodeficiency gene variation databases from the IDbases/MUTbase system at Lund University into the LOVD platform, with all variant coordinates standardised to GRCh38 and HGVS nomenclature. The pipeline extracts 7,341 variation records from IDbases pub.html files, maps gene sequences against historical genome assemblies (hg16–hg18) via BLAST, lifts coordinates to GRCh38, converts them to VCF, and prepares HGVS descriptions via Mutalyzer. Steps 1–5 are complete; Step 6 (Mutalyzer submission) is in progress. Currently ∼1,189 unique variant positions have been processed through to VCF; transfer of the full 7,341 patient records (including duplicates) and handling of remaining edge cases are outstanding before LOVD import can begin.</w:t>
+        <w:t>This pipeline migrates 131 immunodeficiency gene variation databases from the IDbases system at Lund University into the LOVD platform, with all variant coordinates standardised to GRCh38 and HGVS nomenclature. The pipeline extracts 7,341 variation records from IDbases pub.html files, maps gene sequences against historical genome assemblies (hg16–hg18) via BLAST, lifts coordinates to GRCh38, converts them to VCF, and prepares HGVS descriptions via Mutalyzer. Steps 1–5 are complete; Step 6 (Mutalyzer submission) is in progress. Currently ∼1,189 unique variant positions have been processed through to VCF; transfer of the full 7,341 patient records (including duplicates) and handling of remaining edge cases are outstanding before LOVD import can begin.</w:t>
       </w:r>
     </w:p>
     <w:p>
@@ -2564,6 +2564,47 @@
           <w:color w:val="000000"/>
         </w:rPr>
         <w:t xml:space="preserve"> is a full genomic sequence of ~34.2 kb, covering all exons, introns, and flanking regions of chromosome 20q13 — not merely the CDS. The BLAST alignment against hg16 confirms the sequence maps to chr20:43,932,593–43,966,805 (reverse strand). This full-genomic convention applies to all RSG records in the pipeline.</w:t>
+      </w:r>
+    </w:p>
+    <w:p>
+      <w:pPr>
+        <w:pStyle w:val="Heading2"/>
+      </w:pPr>
+      <w:r>
+        <w:t>5.11  MUTbase Folder Removal</w:t>
+      </w:r>
+    </w:p>
+    <w:p>
+      <w:pPr>
+        <w:spacing w:before="60" w:after="60"/>
+      </w:pPr>
+      <w:r>
+        <w:rPr>
+          <w:color w:val="000000"/>
+        </w:rPr>
+        <w:t xml:space="preserve">A folder named “MUTbase” was found in the 02_Source_Database/idbase/ directory and has been removed. MUTbase is a separate general-purpose mutation database system developed at Lund University; it is not one of the 131 immunodeficiency locus-specific databases (LSDBs) that this pipeline is designed to migrate. Its presence in the idbase folder was accidental — the IDbases system and MUTbase share the same hosting environment at Lund University, which likely caused the folder to appear alongside the legitimate gene databases.</w:t>
+      </w:r>
+    </w:p>
+    <w:p>
+      <w:pPr>
+        <w:spacing w:before="60" w:after="60"/>
+      </w:pPr>
+      <w:r>
+        <w:rPr>
+          <w:color w:val="000000"/>
+        </w:rPr>
+        <w:t xml:space="preserve">Impact on pipeline outputs: none. The extract_mutations.py script produced 0 variation records from the MUTbase folder before its removal (MUTbase uses a different internal data format and its pub.html files do not follow the IDbases patient-record structure). All counts and output files are unchanged.</w:t>
+      </w:r>
+    </w:p>
+    <w:p>
+      <w:pPr>
+        <w:spacing w:before="60" w:after="60"/>
+      </w:pPr>
+      <w:r>
+        <w:rPr>
+          <w:color w:val="000000"/>
+        </w:rPr>
+        <w:t xml:space="preserve">Note on terminology: references to “MUTbase software suite” or “MUTbase platform” elsewhere in this document (including Section 5.10) refer to the underlying software framework that the IDbases gene databases are built on — not to the standalone MUTbase database that was removed.</w:t>
       </w:r>
     </w:p>
     <w:p>
@@ -11109,6 +11150,282 @@
                 <w:szCs w:val="22"/>
               </w:rPr>
               <w:t xml:space="preserve">7,341 variations from all IDbases genes (Step 1)</w:t>
+            </w:r>
+          </w:p>
+        </w:tc>
+      </w:tr>
+      <w:tr>
+        <w:tc>
+          <w:tcPr>
+            <w:tcW w:type="dxa" w:w="4000"/>
+            <w:tcBorders>
+              <w:top w:val="single" w:color="CCCCCC" w:sz="1"/>
+              <w:left w:val="single" w:color="CCCCCC" w:sz="1"/>
+              <w:bottom w:val="single" w:color="CCCCCC" w:sz="1"/>
+              <w:right w:val="single" w:color="CCCCCC" w:sz="1"/>
+            </w:tcBorders>
+            <w:shd w:fill="FFFFFF" w:val="clear"/>
+            <w:tcMar>
+              <w:top w:type="dxa" w:w="60"/>
+              <w:left w:type="dxa" w:w="100"/>
+              <w:bottom w:type="dxa" w:w="60"/>
+              <w:right w:type="dxa" w:w="100"/>
+            </w:tcMar>
+            <w:vAlign w:val="top"/>
+          </w:tcPr>
+          <w:p>
+            <w:pPr>
+              <w:spacing w:after="30" w:before="30"/>
+            </w:pPr>
+            <w:r>
+              <w:rPr>
+                <w:rFonts w:ascii="Courier New" w:cs="Courier New" w:hAnsi="Courier New"/>
+                <w:color w:val="2C2C2C"/>
+                <w:sz w:val="20"/>
+                <w:szCs w:val="20"/>
+              </w:rPr>
+              <w:t xml:space="preserve">  all_mutations/</w:t>
+            </w:r>
+          </w:p>
+        </w:tc>
+        <w:tc>
+          <w:tcPr>
+            <w:tcW w:type="dxa" w:w="5200"/>
+            <w:tcBorders>
+              <w:top w:val="single" w:color="CCCCCC" w:sz="1"/>
+              <w:left w:val="single" w:color="CCCCCC" w:sz="1"/>
+              <w:bottom w:val="single" w:color="CCCCCC" w:sz="1"/>
+              <w:right w:val="single" w:color="CCCCCC" w:sz="1"/>
+            </w:tcBorders>
+            <w:shd w:fill="FFFFFF" w:val="clear"/>
+            <w:tcMar>
+              <w:top w:type="dxa" w:w="60"/>
+              <w:left w:type="dxa" w:w="100"/>
+              <w:bottom w:type="dxa" w:w="60"/>
+              <w:right w:type="dxa" w:w="100"/>
+            </w:tcMar>
+            <w:vAlign w:val="top"/>
+          </w:tcPr>
+          <w:p>
+            <w:pPr>
+              <w:spacing w:after="30" w:before="30"/>
+            </w:pPr>
+            <w:r>
+              <w:rPr>
+                <w:b w:val="false"/>
+                <w:bCs w:val="false"/>
+                <w:color w:val="000000"/>
+                <w:sz w:val="22"/>
+                <w:szCs w:val="22"/>
+              </w:rPr>
+              <w:t xml:space="preserve">Sub-folder for data-quality-filtered outputs (Step 1)</w:t>
+            </w:r>
+          </w:p>
+        </w:tc>
+      </w:tr>
+      <w:tr>
+        <w:tc>
+          <w:tcPr>
+            <w:tcW w:type="dxa" w:w="4000"/>
+            <w:tcBorders>
+              <w:top w:val="single" w:color="CCCCCC" w:sz="1"/>
+              <w:left w:val="single" w:color="CCCCCC" w:sz="1"/>
+              <w:bottom w:val="single" w:color="CCCCCC" w:sz="1"/>
+              <w:right w:val="single" w:color="CCCCCC" w:sz="1"/>
+            </w:tcBorders>
+            <w:shd w:fill="FFFFFF" w:val="clear"/>
+            <w:tcMar>
+              <w:top w:type="dxa" w:w="60"/>
+              <w:left w:type="dxa" w:w="100"/>
+              <w:bottom w:type="dxa" w:w="60"/>
+              <w:right w:type="dxa" w:w="100"/>
+            </w:tcMar>
+            <w:vAlign w:val="top"/>
+          </w:tcPr>
+          <w:p>
+            <w:pPr>
+              <w:spacing w:after="30" w:before="30"/>
+            </w:pPr>
+            <w:r>
+              <w:rPr>
+                <w:rFonts w:ascii="Courier New" w:cs="Courier New" w:hAnsi="Courier New"/>
+                <w:color w:val="2C2C2C"/>
+                <w:sz w:val="20"/>
+                <w:szCs w:val="20"/>
+              </w:rPr>
+              <w:t xml:space="preserve">  all_mutations/all_mutations.tsv</w:t>
+            </w:r>
+          </w:p>
+        </w:tc>
+        <w:tc>
+          <w:tcPr>
+            <w:tcW w:type="dxa" w:w="5200"/>
+            <w:tcBorders>
+              <w:top w:val="single" w:color="CCCCCC" w:sz="1"/>
+              <w:left w:val="single" w:color="CCCCCC" w:sz="1"/>
+              <w:bottom w:val="single" w:color="CCCCCC" w:sz="1"/>
+              <w:right w:val="single" w:color="CCCCCC" w:sz="1"/>
+            </w:tcBorders>
+            <w:shd w:fill="FFFFFF" w:val="clear"/>
+            <w:tcMar>
+              <w:top w:type="dxa" w:w="60"/>
+              <w:left w:type="dxa" w:w="100"/>
+              <w:bottom w:type="dxa" w:w="60"/>
+              <w:right w:type="dxa" w:w="100"/>
+            </w:tcMar>
+            <w:vAlign w:val="top"/>
+          </w:tcPr>
+          <w:p>
+            <w:pPr>
+              <w:spacing w:after="30" w:before="30"/>
+            </w:pPr>
+            <w:r>
+              <w:rPr>
+                <w:b w:val="false"/>
+                <w:bCs w:val="false"/>
+                <w:color w:val="000000"/>
+                <w:sz w:val="22"/>
+                <w:szCs w:val="22"/>
+              </w:rPr>
+              <w:t xml:space="preserve">Clean set: 7,276 rows (Problems 1 &amp; 2 excluded). Adds sysname_per_allele and irregular_sysname_flag columns (Step 1)</w:t>
+            </w:r>
+          </w:p>
+        </w:tc>
+      </w:tr>
+      <w:tr>
+        <w:tc>
+          <w:tcPr>
+            <w:tcW w:type="dxa" w:w="4000"/>
+            <w:tcBorders>
+              <w:top w:val="single" w:color="CCCCCC" w:sz="1"/>
+              <w:left w:val="single" w:color="CCCCCC" w:sz="1"/>
+              <w:bottom w:val="single" w:color="CCCCCC" w:sz="1"/>
+              <w:right w:val="single" w:color="CCCCCC" w:sz="1"/>
+            </w:tcBorders>
+            <w:shd w:fill="FFFFFF" w:val="clear"/>
+            <w:tcMar>
+              <w:top w:type="dxa" w:w="60"/>
+              <w:left w:type="dxa" w:w="100"/>
+              <w:bottom w:type="dxa" w:w="60"/>
+              <w:right w:type="dxa" w:w="100"/>
+            </w:tcMar>
+            <w:vAlign w:val="top"/>
+          </w:tcPr>
+          <w:p>
+            <w:pPr>
+              <w:spacing w:after="30" w:before="30"/>
+            </w:pPr>
+            <w:r>
+              <w:rPr>
+                <w:rFonts w:ascii="Courier New" w:cs="Courier New" w:hAnsi="Courier New"/>
+                <w:color w:val="2C2C2C"/>
+                <w:sz w:val="20"/>
+                <w:szCs w:val="20"/>
+              </w:rPr>
+              <w:t xml:space="preserve">  all_mutations/all_mutations_no_subs.tsv</w:t>
+            </w:r>
+          </w:p>
+        </w:tc>
+        <w:tc>
+          <w:tcPr>
+            <w:tcW w:type="dxa" w:w="5200"/>
+            <w:tcBorders>
+              <w:top w:val="single" w:color="CCCCCC" w:sz="1"/>
+              <w:left w:val="single" w:color="CCCCCC" w:sz="1"/>
+              <w:bottom w:val="single" w:color="CCCCCC" w:sz="1"/>
+              <w:right w:val="single" w:color="CCCCCC" w:sz="1"/>
+            </w:tcBorders>
+            <w:shd w:fill="FFFFFF" w:val="clear"/>
+            <w:tcMar>
+              <w:top w:type="dxa" w:w="60"/>
+              <w:left w:type="dxa" w:w="100"/>
+              <w:bottom w:type="dxa" w:w="60"/>
+              <w:right w:type="dxa" w:w="100"/>
+            </w:tcMar>
+            <w:vAlign w:val="top"/>
+          </w:tcPr>
+          <w:p>
+            <w:pPr>
+              <w:spacing w:after="30" w:before="30"/>
+            </w:pPr>
+            <w:r>
+              <w:rPr>
+                <w:b w:val="false"/>
+                <w:bCs w:val="false"/>
+                <w:color w:val="000000"/>
+                <w:sz w:val="22"/>
+                <w:szCs w:val="22"/>
+              </w:rPr>
+              <w:t xml:space="preserve">59 rows: Problem 1 incomplete substitution variants; includes is_sequence_in_feature column (Step 1)</w:t>
+            </w:r>
+          </w:p>
+        </w:tc>
+      </w:tr>
+      <w:tr>
+        <w:tc>
+          <w:tcPr>
+            <w:tcW w:type="dxa" w:w="4000"/>
+            <w:tcBorders>
+              <w:top w:val="single" w:color="CCCCCC" w:sz="1"/>
+              <w:left w:val="single" w:color="CCCCCC" w:sz="1"/>
+              <w:bottom w:val="single" w:color="CCCCCC" w:sz="1"/>
+              <w:right w:val="single" w:color="CCCCCC" w:sz="1"/>
+            </w:tcBorders>
+            <w:shd w:fill="FFFFFF" w:val="clear"/>
+            <w:tcMar>
+              <w:top w:type="dxa" w:w="60"/>
+              <w:left w:type="dxa" w:w="100"/>
+              <w:bottom w:type="dxa" w:w="60"/>
+              <w:right w:type="dxa" w:w="100"/>
+            </w:tcMar>
+            <w:vAlign w:val="top"/>
+          </w:tcPr>
+          <w:p>
+            <w:pPr>
+              <w:spacing w:after="30" w:before="30"/>
+            </w:pPr>
+            <w:r>
+              <w:rPr>
+                <w:rFonts w:ascii="Courier New" w:cs="Courier New" w:hAnsi="Courier New"/>
+                <w:color w:val="2C2C2C"/>
+                <w:sz w:val="20"/>
+                <w:szCs w:val="20"/>
+              </w:rPr>
+              <w:t xml:space="preserve">  all_mutations/all_mutations_long_seq.tsv</w:t>
+            </w:r>
+          </w:p>
+        </w:tc>
+        <w:tc>
+          <w:tcPr>
+            <w:tcW w:type="dxa" w:w="5200"/>
+            <w:tcBorders>
+              <w:top w:val="single" w:color="CCCCCC" w:sz="1"/>
+              <w:left w:val="single" w:color="CCCCCC" w:sz="1"/>
+              <w:bottom w:val="single" w:color="CCCCCC" w:sz="1"/>
+              <w:right w:val="single" w:color="CCCCCC" w:sz="1"/>
+            </w:tcBorders>
+            <w:shd w:fill="FFFFFF" w:val="clear"/>
+            <w:tcMar>
+              <w:top w:type="dxa" w:w="60"/>
+              <w:left w:type="dxa" w:w="100"/>
+              <w:bottom w:type="dxa" w:w="60"/>
+              <w:right w:type="dxa" w:w="100"/>
+            </w:tcMar>
+            <w:vAlign w:val="top"/>
+          </w:tcPr>
+          <w:p>
+            <w:pPr>
+              <w:spacing w:after="30" w:before="30"/>
+            </w:pPr>
+            <w:r>
+              <w:rPr>
+                <w:b w:val="false"/>
+                <w:bCs w:val="false"/>
+                <w:color w:val="000000"/>
+                <w:sz w:val="22"/>
+                <w:szCs w:val="22"/>
+              </w:rPr>
+              <w:t xml:space="preserve">6 rows: Problem 2 long-sequence placeholder sysnames (g. c. r.) (Step 1)</w:t>
             </w:r>
           </w:p>
         </w:tc>
@@ -15587,7 +15904,7 @@
         <w:pStyle w:val="Heading2"/>
       </w:pPr>
       <w:r>
-        <w:t>5.9  MUTbase Format</w:t>
+        <w:t>5.9  all_mutations.tsv Data Quality Issues (Problems 1–3)</w:t>
       </w:r>
     </w:p>
     <w:p>
@@ -15598,7 +15915,61 @@
         <w:rPr>
           <w:color w:val="000000"/>
         </w:rPr>
-        <w:t>IDbases is built on the MUTbase software suite developed at Lund University since 1999. MUTbase underpins all source data this pipeline reads and transforms; understanding its format is essential for interpreting parsing decisions and edge cases.</w:t>
+        <w:t xml:space="preserve">Three categories of variation records in all_mutations.tsv were identified as problematic and are extracted into separate output files in Output/all_mutations/. The script extract_mutations.py was updated to classify and route each row accordingly; the clean set (7,276 rows) is written to Output/all_mutations/all_mutations.tsv with additional sysname_per_allele and irregular_sysname_flag columns.</w:t>
+      </w:r>
+    </w:p>
+    <w:p>
+      <w:pPr>
+        <w:spacing w:before="60" w:after="60"/>
+      </w:pPr>
+      <w:r>
+        <w:rPr>
+          <w:b/>
+          <w:color w:val="000000"/>
+        </w:rPr>
+        <w:t xml:space="preserve">Problem 1 — Incomplete substitution variants (59 rows). </w:t>
+      </w:r>
+      <w:r>
+        <w:rPr>
+          <w:color w:val="000000"/>
+        </w:rPr>
+        <w:t xml:space="preserve">Some sysname entries contain a DNA/RNA change that ends with ‘&gt;’ without specifying the target nucleotide (e.g. g.206889&gt;, c.13242+1&gt;). These 59 records are excluded from the clean set and written to Output/all_mutations/all_mutations_no_subs.tsv. An additional column is_sequence_in_feature records whether the Feature /change field in the pub.html source encodes a long nucleotide sequence (more than 3 nucleotide characters), which indicates the entry is likely a deletion or complex rearrangement rather than a truly missing substitution target. Of the 59 rows, 43 carry a sequence in the Feature block; 16 have no Feature change data (is_sequence_in_feature = None). Detection pattern: sysname matches [gcr].[...][A-Za-z0-9]&gt; immediately followed by a delimiter or end of string.</w:t>
+      </w:r>
+    </w:p>
+    <w:p>
+      <w:pPr>
+        <w:spacing w:before="60" w:after="60"/>
+      </w:pPr>
+      <w:r>
+        <w:rPr>
+          <w:b/>
+          <w:color w:val="000000"/>
+        </w:rPr>
+        <w:t xml:space="preserve">Problem 2 — Long-sequence placeholder sysnames (6 rows). </w:t>
+      </w:r>
+      <w:r>
+        <w:rPr>
+          <w:color w:val="000000"/>
+        </w:rPr>
+        <w:t xml:space="preserve">Six records (ELA2: 4 entries; FOXP3: 2 entries) carry a sysname of g. c. r. or g. c. r (with optional trailing period), indicating that the full mutation sequence is too long to encode in the systematic name field and was instead stored in the Feature /change line of the pub.html source. These 6 rows are excluded from the clean set and written to Output/all_mutations/all_mutations_long_seq.tsv. There is no overlap between Problem 1 and Problem 2.</w:t>
+      </w:r>
+    </w:p>
+    <w:p>
+      <w:pPr>
+        <w:spacing w:before="60" w:after="60"/>
+      </w:pPr>
+      <w:r>
+        <w:rPr>
+          <w:b/>
+          <w:color w:val="000000"/>
+        </w:rPr>
+        <w:t xml:space="preserve">Problem 3 — Multi-allele sysname encoding (2,820 rows in clean set, 14 irregular). </w:t>
+      </w:r>
+      <w:r>
+        <w:rPr>
+          <w:color w:val="000000"/>
+        </w:rPr>
+        <w:t xml:space="preserve">Many sysname fields encode compound heterozygous or multi-allele entries as a single string using semicolons and ‘Allele N:’ labels (e.g. “Allele 1: g.4037C&gt;T, c.102C&gt;T, p.Q3X; Allele 2: g.29885G&gt;A, c.520G&gt;A, p.R142Q”). The clean set contains 2,820 such rows; these are split per allele and the relevant allele-specific sysname is recorded in the new sysname_per_allele column of Output/all_mutations/all_mutations.tsv. A further 14 entries use the ‘Allele 1 and 2:’ label pattern in an ambiguous way — either encoding two distinct genomic positions under one label or nesting an additional ‘Allele N:’ marker inside the content — and could not be reliably split automatically. These 14 irregular entries are flagged with irregular_sysname_flag = True and their sysname_per_allele retains the full original sysname for manual review. Examples of irregular entries include CFD D0006, NHEJ1 N0003, and MRE11A M0004.</w:t>
       </w:r>
     </w:p>
     <w:p>
@@ -15609,7 +15980,37 @@
         <w:rPr>
           <w:color w:val="000000"/>
         </w:rPr>
-        <w:t>Each gene database is stored as a *pub.html file (e.g. adapub.html). Within each file, patient records follow a structured flat-text format embedded in HTML. Key fields: an Accession line (e.g. “Accession A0052”); a “Feature dna;” block containing a /loc:IDRefSeq field with the 1-based variant position within the gene’s IDRefSeq sequence; and a /name field with the systematic HGVS-like description. Allele information is encoded via allele number suffixes on successive /loc lines. MUTbase does not use a relational database or API — all data must be scraped via string parsing — and lacks standardised HGVS nomenclature support or GRCh38 coordinate references, which is the primary motivation for this migration pipeline.</w:t>
+        <w:t xml:space="preserve">Summary of row counts: Total extracted = 7,341; Problem 1 (no_subs) = 59; Problem 2 (long_seq) = 6; Clean set = 7,276 (59 + 6 + 7,276 = 7,341).</w:t>
+      </w:r>
+    </w:p>
+    <w:p>
+      <w:pPr>
+        <w:pStyle w:val="Heading2"/>
+      </w:pPr>
+      <w:r>
+        <w:t>5.10  MUTbase Format</w:t>
+      </w:r>
+    </w:p>
+    <w:p>
+      <w:pPr>
+        <w:spacing w:before="60" w:after="60"/>
+      </w:pPr>
+      <w:r>
+        <w:rPr>
+          <w:color w:val="000000"/>
+        </w:rPr>
+        <w:t>The IDbases databases are built on the MUTbase software platform developed at Lund University since 1999. Important distinction: the term “MUTbase” throughout this document refers to this underlying software platform, not to the standalone MUTbase mutation database (see Section 5.11 below). Understanding the IDbases/MUTbase data format is essential for interpreting parsing decisions and edge cases.</w:t>
+      </w:r>
+    </w:p>
+    <w:p>
+      <w:pPr>
+        <w:spacing w:before="60" w:after="60"/>
+      </w:pPr>
+      <w:r>
+        <w:rPr>
+          <w:color w:val="000000"/>
+        </w:rPr>
+        <w:t>Each gene database is stored as a *pub.html file (e.g. adapub.html). Within each file, patient records follow a structured flat-text format embedded in HTML. Key fields: an Accession line (e.g. “Accession A0052”); a “Feature dna;” block containing a /loc:IDRefSeq field with the 1-based variant position within the gene’s IDRefSeq sequence; and a /name field with the systematic HGVS-like description. Allele information is encoded via allele number suffixes on successive /loc lines. The IDbases platform does not expose a relational database or API — all data must be scraped via string parsing — and lacks standardised HGVS nomenclature support or GRCh38 coordinate references, which is the primary motivation for this migration pipeline.</w:t>
       </w:r>
     </w:p>
     <w:p>

</xml_diff>